<commit_message>
docs: reflect approved platform automation
</commit_message>
<xml_diff>
--- a/docs/Group22_Inventory_Management_Project_Report.docx
+++ b/docs/Group22_Inventory_Management_Project_Report.docx
@@ -442,14 +442,8 @@
             <w:vAlign w:val="center"/>
           </w:tcPr>
           <w:p>
-            <w:pPr>
-              <w:spacing w:after="0" w:line="252" w:lineRule="auto"/>
-            </w:pPr>
             <w:r>
-              <w:rPr>
-                <w:sz w:val="20"/>
-              </w:rPr>
-              <w:t>19 September 2026</w:t>
+              <w:t>21 September 2026</w:t>
             </w:r>
           </w:p>
         </w:tc>
@@ -498,7 +492,7 @@
         <w:pStyle w:val="BodyText"/>
       </w:pPr>
       <w:r>
-        <w:t>This report records the final design, implementation, evidence, decisions, and operating model for the Inventory Management System capstone. It distinguishes completed work from conditional controls and future improvements. The central result is a tested AWS solution that can be created and removed through Terraform while retained logs and portable database backups remain in an independent S3 archive.</w:t>
+        <w:t>This report records the final design, implementation, evidence, decisions, and operating model for the Inventory Management System capstone. It distinguishes completed work from conditional controls and future improvements. The central result is a tested AWS solution created through a reviewed GitHub Actions Terraform workflow, delivered with short-lived OIDC credentials, and removable without affecting retained logs, state, or portable database backups in an independent S3 archive.</w:t>
       </w:r>
     </w:p>
     <w:p>
@@ -1362,14 +1356,8 @@
             <w:shd w:fill="F4F8FC"/>
           </w:tcPr>
           <w:p>
-            <w:pPr>
-              <w:spacing w:after="0" w:line="252" w:lineRule="auto"/>
-            </w:pPr>
             <w:r>
-              <w:rPr>
-                <w:sz w:val="19"/>
-              </w:rPr>
-              <w:t>Cleanup</w:t>
+              <w:t>Infrastructure automation</w:t>
             </w:r>
           </w:p>
         </w:tc>
@@ -1386,14 +1374,30 @@
             <w:shd w:fill="F4F8FC"/>
           </w:tcPr>
           <w:p>
-            <w:pPr>
-              <w:spacing w:after="0" w:line="252" w:lineRule="auto"/>
-            </w:pPr>
             <w:r>
-              <w:rPr>
-                <w:sz w:val="19"/>
-              </w:rPr>
-              <w:t>50 dev resources destroyed and dev Terraform state empty</w:t>
+              <w:t>Reviewed dev plan approved and applied through GitHub Actions with OIDC</w:t>
+            </w:r>
+          </w:p>
+        </w:tc>
+      </w:tr>
+      <w:tr>
+        <w:tc>
+          <w:tcPr>
+            <w:tcW w:type="dxa" w:w="4939"/>
+          </w:tcPr>
+          <w:p>
+            <w:r>
+              <w:t>Current deployment</w:t>
+            </w:r>
+          </w:p>
+        </w:tc>
+        <w:tc>
+          <w:tcPr>
+            <w:tcW w:type="dxa" w:w="4939"/>
+          </w:tcPr>
+          <w:p>
+            <w:r>
+              <w:t>ECS rollout completed with 1 desired and 1 running task; ALB readiness HTTP 200</w:t>
             </w:r>
           </w:p>
         </w:tc>
@@ -1421,7 +1425,7 @@
         <w:pStyle w:val="BodyText"/>
       </w:pPr>
       <w:r>
-        <w:t>The application deployed successfully, passed readiness checks, handled the bounded load test without failed requests, scaled out and in as designed, produced and restored a portable SQL backup, retained operational evidence, and allowed the disposable dev environment to be removed without deleting archived data.</w:t>
+        <w:t>The application deployed successfully, passed readiness checks, handled the bounded load test without failed requests, scaled out and in as designed, produced and restored a portable SQL backup, and retained operational evidence. The current dev platform was recreated through an approved Terraform workflow, deployed through CI/CD, and verified with a completed ECS rollout and ALB readiness HTTP 200.</w:t>
       </w:r>
     </w:p>
     <w:p>
@@ -3419,7 +3423,7 @@
         <w:pStyle w:val="BodyText"/>
       </w:pPr>
       <w:r>
-        <w:t>GitHub Actions separates validation from deployment. CI runs for pull requests and pushes to master. CD starts after successful CI on master or an approved manual dispatch, and the DEV_INFRA_ENABLED variable prevents attempts to deploy while the disposable environment is offline.</w:t>
+        <w:t>GitHub Actions separates validation, reviewed infrastructure change, and application delivery. CI runs for pull requests and pushes to master. The Terraform workflow creates a plan, waits for protected-environment approval, and applies dev automatically on master or dev or prod through manual dispatch. CD starts after successful CI on master and safely skips if the dev ECS service or ECR repository is absent.</w:t>
       </w:r>
     </w:p>
     <w:p>
@@ -3490,7 +3494,7 @@
         <w:pStyle w:val="ListBullet"/>
       </w:pPr>
       <w:r>
-        <w:t>CI runs Maven tests and packaging, Gitleaks, Terraform validation, Checkov, Docker build, Trivy, and conditional Sonar analysis.</w:t>
+        <w:t>CI runs Maven tests and packaging, Gitleaks, Terraform validation, Checkov, Docker build, Trivy, and SonarCloud analysis. The latest reviewed change passed the SonarCloud Quality Gate with no new security issues or hotspots.</w:t>
       </w:r>
     </w:p>
     <w:p>
@@ -3498,7 +3502,7 @@
         <w:pStyle w:val="ListBullet"/>
       </w:pPr>
       <w:r>
-        <w:t>CD assumes an AWS role through OIDC, pushes a commit-SHA image to ECR, renders a new ECS task revision, and waits for service stability.</w:t>
+        <w:t>For a first deployment, the approved Terraform workflow creates the foundation, pushes the first commit-SHA image, deploys one task, and enables autoscaling. Later CD runs assume an AWS role through OIDC, push a commit-SHA image to ECR, render a new ECS task revision, and wait for service stability.</w:t>
       </w:r>
     </w:p>
     <w:p>
@@ -3833,14 +3837,8 @@
             <w:vAlign w:val="center"/>
           </w:tcPr>
           <w:p>
-            <w:pPr>
-              <w:spacing w:after="0" w:line="252" w:lineRule="auto"/>
-            </w:pPr>
             <w:r>
-              <w:rPr>
-                <w:sz w:val="16"/>
-              </w:rPr>
-              <w:t>Sonar analysis</w:t>
+              <w:t>SonarCloud Quality Gate</w:t>
             </w:r>
           </w:p>
         </w:tc>
@@ -3856,14 +3854,8 @@
             <w:vAlign w:val="center"/>
           </w:tcPr>
           <w:p>
-            <w:pPr>
-              <w:spacing w:after="0" w:line="252" w:lineRule="auto"/>
-            </w:pPr>
             <w:r>
-              <w:rPr>
-                <w:sz w:val="16"/>
-              </w:rPr>
-              <w:t>Conditional on token</w:t>
+              <w:t>Enabled for reviewed changes</w:t>
             </w:r>
           </w:p>
         </w:tc>
@@ -4909,14 +4901,8 @@
             <w:shd w:fill="F4F8FC"/>
           </w:tcPr>
           <w:p>
-            <w:pPr>
-              <w:spacing w:after="0" w:line="252" w:lineRule="auto"/>
-            </w:pPr>
             <w:r>
-              <w:rPr>
-                <w:sz w:val="16"/>
-              </w:rPr>
-              <w:t>Container</w:t>
+              <w:t>Code quality</w:t>
             </w:r>
           </w:p>
         </w:tc>
@@ -4933,14 +4919,8 @@
             <w:shd w:fill="F4F8FC"/>
           </w:tcPr>
           <w:p>
-            <w:pPr>
-              <w:spacing w:after="0" w:line="252" w:lineRule="auto"/>
-            </w:pPr>
             <w:r>
-              <w:rPr>
-                <w:sz w:val="16"/>
-              </w:rPr>
-              <w:t>Trivy</w:t>
+              <w:t>SonarCloud Quality Gate</w:t>
             </w:r>
           </w:p>
         </w:tc>
@@ -4957,14 +4937,8 @@
             <w:shd w:fill="F4F8FC"/>
           </w:tcPr>
           <w:p>
-            <w:pPr>
-              <w:spacing w:after="0" w:line="252" w:lineRule="auto"/>
-            </w:pPr>
             <w:r>
-              <w:rPr>
-                <w:sz w:val="16"/>
-              </w:rPr>
-              <w:t>Blocking gate succeeded</w:t>
+              <w:t>Passed with no new security issues or hotspots</w:t>
             </w:r>
           </w:p>
         </w:tc>
@@ -5417,14 +5391,8 @@
             <w:vAlign w:val="center"/>
           </w:tcPr>
           <w:p>
-            <w:pPr>
-              <w:spacing w:after="0" w:line="252" w:lineRule="auto"/>
-            </w:pPr>
             <w:r>
-              <w:rPr>
-                <w:sz w:val="16"/>
-              </w:rPr>
-              <w:t>Teardown</w:t>
+              <w:t>Infrastructure automation</w:t>
             </w:r>
           </w:p>
         </w:tc>
@@ -5440,14 +5408,8 @@
             <w:vAlign w:val="center"/>
           </w:tcPr>
           <w:p>
-            <w:pPr>
-              <w:spacing w:after="0" w:line="252" w:lineRule="auto"/>
-            </w:pPr>
             <w:r>
-              <w:rPr>
-                <w:sz w:val="16"/>
-              </w:rPr>
-              <w:t>Terraform destroy and state check</w:t>
+              <w:t>GitHub Actions plan approval apply</w:t>
             </w:r>
           </w:p>
         </w:tc>
@@ -5463,14 +5425,40 @@
             <w:vAlign w:val="center"/>
           </w:tcPr>
           <w:p>
-            <w:pPr>
-              <w:spacing w:after="0" w:line="252" w:lineRule="auto"/>
-            </w:pPr>
             <w:r>
-              <w:rPr>
-                <w:sz w:val="16"/>
-              </w:rPr>
-              <w:t>50 destroyed, state empty</w:t>
+              <w:t>Reviewed dev plan applied with OIDC credentials</w:t>
+            </w:r>
+          </w:p>
+        </w:tc>
+      </w:tr>
+      <w:tr>
+        <w:tc>
+          <w:tcPr>
+            <w:tcW w:type="dxa" w:w="3293"/>
+          </w:tcPr>
+          <w:p>
+            <w:r>
+              <w:t>Current deployment</w:t>
+            </w:r>
+          </w:p>
+        </w:tc>
+        <w:tc>
+          <w:tcPr>
+            <w:tcW w:type="dxa" w:w="3293"/>
+          </w:tcPr>
+          <w:p>
+            <w:r>
+              <w:t>ECS and ALB checks</w:t>
+            </w:r>
+          </w:p>
+        </w:tc>
+        <w:tc>
+          <w:tcPr>
+            <w:tcW w:type="dxa" w:w="3293"/>
+          </w:tcPr>
+          <w:p>
+            <w:r>
+              <w:t>Completed rollout with 1 running task and readiness HTTP 200</w:t>
             </w:r>
           </w:p>
         </w:tc>
@@ -5498,7 +5486,7 @@
         <w:pStyle w:val="BodyText"/>
       </w:pPr>
       <w:r>
-        <w:t>The performance result applies to the temporary development configuration and is not a production capacity claim. Production Terraform was validated but not applied. Sonar remained conditional, and Snyk and OWASP ZAP were not implemented.</w:t>
+        <w:t>The performance result applies to the temporary development configuration and is not a production capacity claim. Production Terraform is available through the same reviewed workflow but was not applied. Snyk and OWASP ZAP were not implemented.</w:t>
       </w:r>
     </w:p>
     <w:p>
@@ -5619,7 +5607,7 @@
         <w:pStyle w:val="BodyText"/>
       </w:pPr>
       <w:r>
-        <w:t>The persistent archive uses a private S3 bucket in an independent Terraform state. It blocks public access, denies insecure transport, uses AES256 server-side encryption, enables versioning, expires logs after 30 days, expires portable SQL backups after 90 days, and sets force_destroy to false.</w:t>
+        <w:t>The persistent archive uses a private S3 bucket in an independent Terraform state. EventBridge Scheduler starts the one-off Fargate database-backup task daily at 02:00 UTC by default, while an operator may still run an additional backup on demand. It blocks public access, denies insecure transport, uses AES256 server-side encryption, enables versioning, expires logs after 30 days, expires portable SQL backups after 90 days, and sets force_destroy to false.</w:t>
       </w:r>
     </w:p>
     <w:p>
@@ -6167,13 +6155,7 @@
         <w:ind w:left="389" w:hanging="288"/>
       </w:pPr>
       <w:r>
-        <w:rPr>
-          <w:b/>
-        </w:rPr>
-        <w:t xml:space="preserve">6. </w:t>
-      </w:r>
-      <w:r>
-        <w:t>Set DEV_INFRA_ENABLED to false before destroying dev.</w:t>
+        <w:t>6. Use a reviewed destroy plan when dev is no longer needed; CD detects missing infrastructure and skips safely.</w:t>
       </w:r>
     </w:p>
     <w:p>
@@ -7063,7 +7045,7 @@
         <w:pStyle w:val="BodyText"/>
       </w:pPr>
       <w:r>
-        <w:t>ECS Fargate replaced an always-on EKS cluster for the single-service runtime. Dev avoided NAT, ran one task until autoscaling required another, used bounded retention, and was destroyed after testing. The archive remained because recovery evidence has a different lifecycle from disposable infrastructure.</w:t>
+        <w:t>ECS Fargate replaced an always-on EKS cluster for the single-service runtime. Dev avoided NAT, ran one task until autoscaling required another, used bounded retention, and can be destroyed after testing and recreated through the reviewed workflow. The archive remained because recovery evidence has a different lifecycle from disposable infrastructure.</w:t>
       </w:r>
     </w:p>
     <w:p>
@@ -7083,7 +7065,7 @@
         <w:pStyle w:val="BodyText"/>
       </w:pPr>
       <w:r>
-        <w:t>The engineer disabled CD, archived required logs, created and restored the portable backup, inspected the dev destroy plan, destroyed 50 resources, and confirmed that the dev Terraform state was empty. The S3 archive remained active with retained objects because it uses separate state and force_destroy is false.</w:t>
+        <w:t>The engineer previously archived required logs, created and restored the portable backup, inspected the dev destroy plan, destroyed 50 resources, and confirmed that the dev Terraform state was empty. The environment was later recreated through the approved Terraform workflow; the independent S3 archive remained intact throughout. The S3 archive remained active with retained objects because it uses separate state and force_destroy is false.</w:t>
       </w:r>
     </w:p>
     <w:p>
@@ -7390,14 +7372,8 @@
             <w:vAlign w:val="center"/>
           </w:tcPr>
           <w:p>
-            <w:pPr>
-              <w:spacing w:after="0" w:line="252" w:lineRule="auto"/>
-            </w:pPr>
             <w:r>
-              <w:rPr>
-                <w:sz w:val="17"/>
-              </w:rPr>
-              <w:t>Analysis is conditional</w:t>
+              <w:t>Quality Gate enabled and passing</w:t>
             </w:r>
           </w:p>
         </w:tc>
@@ -7413,14 +7389,8 @@
             <w:vAlign w:val="center"/>
           </w:tcPr>
           <w:p>
-            <w:pPr>
-              <w:spacing w:after="0" w:line="252" w:lineRule="auto"/>
-            </w:pPr>
             <w:r>
-              <w:rPr>
-                <w:sz w:val="17"/>
-              </w:rPr>
-              <w:t>Make the quality gate mandatory</w:t>
+              <w:t>Continue to review new-code findings</w:t>
             </w:r>
           </w:p>
         </w:tc>
@@ -7680,14 +7650,8 @@
             <w:vAlign w:val="center"/>
           </w:tcPr>
           <w:p>
-            <w:pPr>
-              <w:spacing w:after="0" w:line="252" w:lineRule="auto"/>
-            </w:pPr>
             <w:r>
-              <w:rPr>
-                <w:sz w:val="17"/>
-              </w:rPr>
-              <w:t>Scripts require manual execution</w:t>
+              <w:t>Database backup scheduled daily; logs archived on demand</w:t>
             </w:r>
           </w:p>
         </w:tc>
@@ -7703,14 +7667,8 @@
             <w:vAlign w:val="center"/>
           </w:tcPr>
           <w:p>
-            <w:pPr>
-              <w:spacing w:after="0" w:line="252" w:lineRule="auto"/>
-            </w:pPr>
             <w:r>
-              <w:rPr>
-                <w:sz w:val="17"/>
-              </w:rPr>
-              <w:t>Schedule and monitor approved archive operations</w:t>
+              <w:t>Add scheduled log archival and monitoring</w:t>
             </w:r>
           </w:p>
         </w:tc>
@@ -8287,7 +8245,7 @@
         <w:pStyle w:val="BodyText"/>
       </w:pPr>
       <w:r>
-        <w:t>The capstone delivered a secure and repeatable engineering lifecycle for the inventory application. Terraform created the platform, GitHub Actions validated and delivered immutable images, AWS managed the runtime and database, security gates checked source and artifacts, autoscaling responded to load, and independent S3 storage preserved logs and a tested portable backup after dev teardown.</w:t>
+        <w:t>The capstone delivered a secure and repeatable engineering lifecycle for the inventory application. Terraform and GitHub Actions create the platform through a reviewed approval gate, validate and deliver immutable images, use AWS-managed runtime services, enforce security gates, scale under load, and preserve state, logs, and a tested portable backup across dev teardown.</w:t>
       </w:r>
     </w:p>
     <w:p>

</xml_diff>